<commit_message>
added card cooldowon timer
</commit_message>
<xml_diff>
--- a/DENR_Queueing_System_Code_Documentation.docx
+++ b/DENR_Queueing_System_Code_Documentation.docx
@@ -34,20 +34,8 @@
         <w:spacing w:after="480"/>
       </w:pPr>
       <w:r>
-        <w:rPr>
-          <w:rFonts w:ascii="Segoe UI" w:hAnsi="Segoe UI"/>
-          <w:color w:val="708090"/>
-          <w:sz w:val="19"/>
-        </w:rPr>
-        <w:t>Date: July 21, 2026</w:t>
+        <w:t>Date: July 22, 2026</w:t>
         <w:br/>
-      </w:r>
-      <w:r>
-        <w:rPr>
-          <w:rFonts w:ascii="Segoe UI" w:hAnsi="Segoe UI"/>
-          <w:color w:val="708090"/>
-          <w:sz w:val="19"/>
-        </w:rPr>
         <w:t>Prepared by: Antigravity AI Pair Programmer</w:t>
       </w:r>
     </w:p>
@@ -8215,6 +8203,38 @@
                 <w:sz w:val="19"/>
               </w:rPr>
               <w:t>Calls the completed ticket statistics endpoint based on active range filters.</w:t>
+            </w:r>
+          </w:p>
+        </w:tc>
+      </w:tr>
+      <w:tr>
+        <w:tc>
+          <w:tcPr>
+            <w:tcW w:type="dxa" w:w="4680"/>
+          </w:tcPr>
+          <w:p>
+            <w:r>
+              <w:rPr>
+                <w:rFonts w:ascii="Consolas" w:hAnsi="Consolas"/>
+                <w:b/>
+                <w:sz w:val="19"/>
+              </w:rPr>
+              <w:t>resetStatisticsFilters()</w:t>
+            </w:r>
+          </w:p>
+        </w:tc>
+        <w:tc>
+          <w:tcPr>
+            <w:tcW w:type="dxa" w:w="4680"/>
+          </w:tcPr>
+          <w:p>
+            <w:r>
+              <w:rPr>
+                <w:rFonts w:ascii="Segoe UI" w:hAnsi="Segoe UI"/>
+                <w:b w:val="0"/>
+                <w:sz w:val="19"/>
+              </w:rPr>
+              <w:t>Resets the operator dashboard performance statistics timeframe filters to 'today' and reloads the data from the server. @return void</w:t>
             </w:r>
           </w:p>
         </w:tc>

</xml_diff>